<commit_message>
docs(workbook): el34 적응 콘텐츠로 학생 워크북 전체 재생성 (145 .docx)
9개 메인 트랙(.202 외부공격자/.161 웹진입/맥락별 취약웹) 반영. 70→145 갱신.
(레거시 17개 output_contains 시나리오는 6v6 명령출력 모델로 미포팅 — 별도 결정 필요.)

Co-Authored-By: Claude Opus 4.8 (1M context) <noreply@anthropic.com>
</commit_message>
<xml_diff>
--- a/contents/battle-workbook/apt-phase1.docx
+++ b/contents/battle-workbook/apt-phase1.docx
@@ -139,7 +139,7 @@
           <w:b/>
           <w:sz w:val="22"/>
         </w:rPr>
-        <w:t>▶ 실행 결과 화면 (스크린샷 붙여넣기)</w:t>
+        <w:t>▶ 실행 결과 (출력/스크린샷)</w:t>
       </w:r>
     </w:p>
     <w:tbl>
@@ -173,7 +173,7 @@
                 <w:color w:val="AAAAAA"/>
                 <w:sz w:val="18"/>
               </w:rPr>
-              <w:t>여기에 결과 스크린샷을 붙여넣으세요 (커서를 두고 Ctrl+V)</w:t>
+              <w:t>여기에 결과 출력을 적거나 스크린샷을 붙여넣으세요 (커서를 두고 Ctrl+V)</w:t>
             </w:r>
           </w:p>
         </w:tc>
@@ -305,7 +305,7 @@
           <w:b/>
           <w:sz w:val="22"/>
         </w:rPr>
-        <w:t>▶ 실행 결과 화면 (스크린샷 붙여넣기)</w:t>
+        <w:t>▶ 실행 결과 (출력/스크린샷)</w:t>
       </w:r>
     </w:p>
     <w:tbl>
@@ -339,7 +339,7 @@
                 <w:color w:val="AAAAAA"/>
                 <w:sz w:val="18"/>
               </w:rPr>
-              <w:t>여기에 결과 스크린샷을 붙여넣으세요 (커서를 두고 Ctrl+V)</w:t>
+              <w:t>여기에 결과 출력을 적거나 스크린샷을 붙여넣으세요 (커서를 두고 Ctrl+V)</w:t>
             </w:r>
           </w:p>
         </w:tc>
@@ -471,7 +471,7 @@
           <w:b/>
           <w:sz w:val="22"/>
         </w:rPr>
-        <w:t>▶ 실행 결과 화면 (스크린샷 붙여넣기)</w:t>
+        <w:t>▶ 실행 결과 (출력/스크린샷)</w:t>
       </w:r>
     </w:p>
     <w:tbl>
@@ -505,7 +505,7 @@
                 <w:color w:val="AAAAAA"/>
                 <w:sz w:val="18"/>
               </w:rPr>
-              <w:t>여기에 결과 스크린샷을 붙여넣으세요 (커서를 두고 Ctrl+V)</w:t>
+              <w:t>여기에 결과 출력을 적거나 스크린샷을 붙여넣으세요 (커서를 두고 Ctrl+V)</w:t>
             </w:r>
           </w:p>
         </w:tc>
@@ -637,7 +637,7 @@
           <w:b/>
           <w:sz w:val="22"/>
         </w:rPr>
-        <w:t>▶ 실행 결과 화면 (스크린샷 붙여넣기)</w:t>
+        <w:t>▶ 실행 결과 (출력/스크린샷)</w:t>
       </w:r>
     </w:p>
     <w:tbl>
@@ -671,7 +671,7 @@
                 <w:color w:val="AAAAAA"/>
                 <w:sz w:val="18"/>
               </w:rPr>
-              <w:t>여기에 결과 스크린샷을 붙여넣으세요 (커서를 두고 Ctrl+V)</w:t>
+              <w:t>여기에 결과 출력을 적거나 스크린샷을 붙여넣으세요 (커서를 두고 Ctrl+V)</w:t>
             </w:r>
           </w:p>
         </w:tc>
@@ -803,7 +803,7 @@
           <w:b/>
           <w:sz w:val="22"/>
         </w:rPr>
-        <w:t>▶ 실행 결과 화면 (스크린샷 붙여넣기)</w:t>
+        <w:t>▶ 실행 결과 (출력/스크린샷)</w:t>
       </w:r>
     </w:p>
     <w:tbl>
@@ -837,7 +837,7 @@
                 <w:color w:val="AAAAAA"/>
                 <w:sz w:val="18"/>
               </w:rPr>
-              <w:t>여기에 결과 스크린샷을 붙여넣으세요 (커서를 두고 Ctrl+V)</w:t>
+              <w:t>여기에 결과 출력을 적거나 스크린샷을 붙여넣으세요 (커서를 두고 Ctrl+V)</w:t>
             </w:r>
           </w:p>
         </w:tc>
@@ -969,7 +969,7 @@
           <w:b/>
           <w:sz w:val="22"/>
         </w:rPr>
-        <w:t>▶ 실행 결과 화면 (스크린샷 붙여넣기)</w:t>
+        <w:t>▶ 실행 결과 (출력/스크린샷)</w:t>
       </w:r>
     </w:p>
     <w:tbl>
@@ -1003,7 +1003,7 @@
                 <w:color w:val="AAAAAA"/>
                 <w:sz w:val="18"/>
               </w:rPr>
-              <w:t>여기에 결과 스크린샷을 붙여넣으세요 (커서를 두고 Ctrl+V)</w:t>
+              <w:t>여기에 결과 출력을 적거나 스크린샷을 붙여넣으세요 (커서를 두고 Ctrl+V)</w:t>
             </w:r>
           </w:p>
         </w:tc>
@@ -1135,7 +1135,7 @@
           <w:b/>
           <w:sz w:val="22"/>
         </w:rPr>
-        <w:t>▶ 실행 결과 화면 (스크린샷 붙여넣기)</w:t>
+        <w:t>▶ 실행 결과 (출력/스크린샷)</w:t>
       </w:r>
     </w:p>
     <w:tbl>
@@ -1169,7 +1169,7 @@
                 <w:color w:val="AAAAAA"/>
                 <w:sz w:val="18"/>
               </w:rPr>
-              <w:t>여기에 결과 스크린샷을 붙여넣으세요 (커서를 두고 Ctrl+V)</w:t>
+              <w:t>여기에 결과 출력을 적거나 스크린샷을 붙여넣으세요 (커서를 두고 Ctrl+V)</w:t>
             </w:r>
           </w:p>
         </w:tc>
@@ -1301,7 +1301,7 @@
           <w:b/>
           <w:sz w:val="22"/>
         </w:rPr>
-        <w:t>▶ 실행 결과 화면 (스크린샷 붙여넣기)</w:t>
+        <w:t>▶ 실행 결과 (출력/스크린샷)</w:t>
       </w:r>
     </w:p>
     <w:tbl>
@@ -1335,7 +1335,7 @@
                 <w:color w:val="AAAAAA"/>
                 <w:sz w:val="18"/>
               </w:rPr>
-              <w:t>여기에 결과 스크린샷을 붙여넣으세요 (커서를 두고 Ctrl+V)</w:t>
+              <w:t>여기에 결과 출력을 적거나 스크린샷을 붙여넣으세요 (커서를 두고 Ctrl+V)</w:t>
             </w:r>
           </w:p>
         </w:tc>
@@ -1467,7 +1467,7 @@
           <w:b/>
           <w:sz w:val="22"/>
         </w:rPr>
-        <w:t>▶ 실행 결과 화면 (스크린샷 붙여넣기)</w:t>
+        <w:t>▶ 실행 결과 (출력/스크린샷)</w:t>
       </w:r>
     </w:p>
     <w:tbl>
@@ -1501,7 +1501,7 @@
                 <w:color w:val="AAAAAA"/>
                 <w:sz w:val="18"/>
               </w:rPr>
-              <w:t>여기에 결과 스크린샷을 붙여넣으세요 (커서를 두고 Ctrl+V)</w:t>
+              <w:t>여기에 결과 출력을 적거나 스크린샷을 붙여넣으세요 (커서를 두고 Ctrl+V)</w:t>
             </w:r>
           </w:p>
         </w:tc>
@@ -1633,7 +1633,7 @@
           <w:b/>
           <w:sz w:val="22"/>
         </w:rPr>
-        <w:t>▶ 실행 결과 화면 (스크린샷 붙여넣기)</w:t>
+        <w:t>▶ 실행 결과 (출력/스크린샷)</w:t>
       </w:r>
     </w:p>
     <w:tbl>
@@ -1667,7 +1667,7 @@
                 <w:color w:val="AAAAAA"/>
                 <w:sz w:val="18"/>
               </w:rPr>
-              <w:t>여기에 결과 스크린샷을 붙여넣으세요 (커서를 두고 Ctrl+V)</w:t>
+              <w:t>여기에 결과 출력을 적거나 스크린샷을 붙여넣으세요 (커서를 두고 Ctrl+V)</w:t>
             </w:r>
           </w:p>
         </w:tc>
@@ -1799,7 +1799,7 @@
           <w:b/>
           <w:sz w:val="22"/>
         </w:rPr>
-        <w:t>▶ 실행 결과 화면 (스크린샷 붙여넣기)</w:t>
+        <w:t>▶ 실행 결과 (출력/스크린샷)</w:t>
       </w:r>
     </w:p>
     <w:tbl>
@@ -1833,7 +1833,7 @@
                 <w:color w:val="AAAAAA"/>
                 <w:sz w:val="18"/>
               </w:rPr>
-              <w:t>여기에 결과 스크린샷을 붙여넣으세요 (커서를 두고 Ctrl+V)</w:t>
+              <w:t>여기에 결과 출력을 적거나 스크린샷을 붙여넣으세요 (커서를 두고 Ctrl+V)</w:t>
             </w:r>
           </w:p>
         </w:tc>
@@ -1965,7 +1965,7 @@
           <w:b/>
           <w:sz w:val="22"/>
         </w:rPr>
-        <w:t>▶ 실행 결과 화면 (스크린샷 붙여넣기)</w:t>
+        <w:t>▶ 실행 결과 (출력/스크린샷)</w:t>
       </w:r>
     </w:p>
     <w:tbl>
@@ -1999,7 +1999,7 @@
                 <w:color w:val="AAAAAA"/>
                 <w:sz w:val="18"/>
               </w:rPr>
-              <w:t>여기에 결과 스크린샷을 붙여넣으세요 (커서를 두고 Ctrl+V)</w:t>
+              <w:t>여기에 결과 출력을 적거나 스크린샷을 붙여넣으세요 (커서를 두고 Ctrl+V)</w:t>
             </w:r>
           </w:p>
         </w:tc>
@@ -2131,7 +2131,7 @@
           <w:b/>
           <w:sz w:val="22"/>
         </w:rPr>
-        <w:t>▶ 실행 결과 화면 (스크린샷 붙여넣기)</w:t>
+        <w:t>▶ 실행 결과 (출력/스크린샷)</w:t>
       </w:r>
     </w:p>
     <w:tbl>
@@ -2165,7 +2165,7 @@
                 <w:color w:val="AAAAAA"/>
                 <w:sz w:val="18"/>
               </w:rPr>
-              <w:t>여기에 결과 스크린샷을 붙여넣으세요 (커서를 두고 Ctrl+V)</w:t>
+              <w:t>여기에 결과 출력을 적거나 스크린샷을 붙여넣으세요 (커서를 두고 Ctrl+V)</w:t>
             </w:r>
           </w:p>
         </w:tc>
@@ -2297,7 +2297,7 @@
           <w:b/>
           <w:sz w:val="22"/>
         </w:rPr>
-        <w:t>▶ 실행 결과 화면 (스크린샷 붙여넣기)</w:t>
+        <w:t>▶ 실행 결과 (출력/스크린샷)</w:t>
       </w:r>
     </w:p>
     <w:tbl>
@@ -2331,7 +2331,7 @@
                 <w:color w:val="AAAAAA"/>
                 <w:sz w:val="18"/>
               </w:rPr>
-              <w:t>여기에 결과 스크린샷을 붙여넣으세요 (커서를 두고 Ctrl+V)</w:t>
+              <w:t>여기에 결과 출력을 적거나 스크린샷을 붙여넣으세요 (커서를 두고 Ctrl+V)</w:t>
             </w:r>
           </w:p>
         </w:tc>

</xml_diff>